<commit_message>
Abstract FMC: bản đầy đủ trong giới hạn 500 từ (VI 493 / EN 479) + gói nộp dựng tự động
- Kiểm lại biểu mẫu thật: ô Tóm tắt chặn 500 KÝ TỰ (bộ đếm ký tự), Tên 150, Đơn vị 400, Tác giả 400, file ≤ 1 MB -> 500 từ áp cho file đính kèm
- Viết lại bằng workflow agent (2 nháp, giám khảo+hợp nhất, 3 kiểm đối kháng) + kiểm toán độc lập (mọi số tính lại từ parquet khớp) + sửa theo kiểm toán
- scripts/build_fmc_package.py: DOCX từ mẫu + PDF, 03_NOI_DUNG_DIEN_FORM.txt đúng từng ô, 00_HUONG_DAN_NOP.pdf (bước, bảng ô, kiểm tra chất lượng, SHA-256), Du_phong_ban_250_tu/
- manuscript/fmc/abstract_fmc_250.md: bản 250 từ đã kiểm toán giữ làm dự phòng

Co-Authored-By: Claude Opus 5.5 (1M context) <noreply@anthropic.com>
</commit_message>
<xml_diff>
--- a/Nop_Final_PhanChauTrinh_HT2026/01_Abstract_TiengViet.docx
+++ b/Nop_Final_PhanChauTrinh_HT2026/01_Abstract_TiengViet.docx
@@ -425,7 +425,7 @@
           <w:szCs w:val="24"/>
           <w14:ligatures w14:val="none"/>
         </w:rPr>
-        <w:t>Mô hình ngôn ngữ lớn (LLM) có thể nêu liều, ngưỡng theo chuẩn nước ngoài hoặc bản cũ thay vì bản hiện hành của Bộ Y tế (BYT); mức độ, nguồn gốc chưa rõ.</w:t>
+        <w:t>Mô hình ngôn ngữ lớn (LLM) có thể nêu liều thuốc hoặc ngưỡng chẩn đoán theo chuẩn nước ngoài hoặc phiên bản cũ thay vì hướng dẫn hiện hành của Bộ Y tế (BYT). Con số có thật ở hướng dẫn khác nên khó nhận ra. Mức độ và nguồn gốc sai lệch chưa rõ.</w:t>
       </w:r>
     </w:p>
     <w:p>
@@ -486,7 +486,7 @@
           <w:szCs w:val="24"/>
           <w14:ligatures w14:val="none"/>
         </w:rPr>
-        <w:t>Thí điểm phương pháp đo và truy nguồn sai lệch.</w:t>
+        <w:t>Thí điểm phương pháp đo tỉ lệ đúng và truy nguồn câu sai (đối chiếu mức trùng ngẫu nhiên), theo ngôn ngữ và điều kiện hỏi.</w:t>
       </w:r>
     </w:p>
     <w:p>
@@ -546,7 +546,7 @@
           <w:szCs w:val="24"/>
           <w14:ligatures w14:val="none"/>
         </w:rPr>
-        <w:t>Phân tích 61 khuyến cáo chọn chủ đích, trích nguyên văn từ 12 văn bản BYT hiện hành. Đối chiếu: chuẩn nước ngoài có tên, bản BYT cũ (khi có), giá trị mồi (giá trị giả đặt trước, đo trùng ngẫu nhiên). Qwen3-8B (mô hình mở nhỏ) trả lời bằng tiếng Việt, tiếng Anh trong ba điều kiện: không nêu quốc gia, nêu BYT, kèm đoạn hướng dẫn. Chấm theo quy tắc định trước; chỉ AI kiểm lại đoạn trích, kết quả chấm.</w:t>
+        <w:t>Thiết kế thí điểm: phân tích 61 khuyến cáo chọn chủ đích (trong 65) thuộc 12 văn bản BYT còn hiệu lực, trích nguyên văn kèm số trang. Ba nhóm: xung đột (20, khác ít nhất một chuẩn nước ngoài có tên; trong đó 15 có mồi: giá trị sai đặt trước, để ước tính mức trùng ngẫu nhiên), phiên bản (20, có bản BYT cũ), đối chứng (21 khuyến cáo còn lại, trùng chuẩn nước ngoài). Qwen3-8B (mô hình mở nhỏ, lượng tử hóa bốn bit, chạy trên laptop) trả lời ngắn bằng tiếng Việt và tiếng Anh ở ba điều kiện: không nêu quốc gia, nêu BYT, kèm đoạn hướng dẫn. Chấm theo quy tắc định trước; chỉ AI (Claude) kiểm tra đoạn trích và 390 câu trả lời ngắn (hai lượt chấm mù, AI phân xử, cho phân tích độ nhạy). Khoảng tin cậy (KTC) 95% Clopper–Pearson; kiểm định McNemar chính xác ghép cặp giữa nêu BYT và kèm đoạn (khám phá, thêm sau khi mở kết quả).</w:t>
       </w:r>
     </w:p>
     <w:p>
@@ -606,7 +606,7 @@
           <w:szCs w:val="24"/>
           <w14:ligatures w14:val="none"/>
         </w:rPr>
-        <w:t>Hỏi bằng tiếng Việt, nêu BYT, trên 20 khuyến cáo khác ít nhất một chuẩn nước ngoài: đúng 7 (35,0%; KTC 95%: 15,4%–59,2%), trùng nước ngoài 2, không khớp nguồn đã ghi nhận 7, bộ chấm không đọc được 4. Trong đó 15 có mồi: trùng nước ngoài 2, trùng mồi 0. Trùng bản cũ: 3/20 khuyến cáo khác có bản cũ. Kèm đoạn hướng dẫn: đúng 13/20 (khám phá: McNemar p = 0,15).</w:t>
+        <w:t>Tiếng Việt, nêu BYT: nhóm xung đột đúng 7/20 (KTC 95%: 15,4%–59,2%); 2 trùng chuẩn nước ngoài, 7 không khớp nguồn đã ghi nhận, 4 câu bộ chấm không đọc được giá trị (phân tích độ nhạy: đúng 8/20); nhóm đối chứng đúng 9/21; nhóm phiên bản 3/20 trùng bản cũ. Ở 15 khuyến cáo có mồi: 2 trùng chuẩn nước ngoài, 0 trùng mồi. Nhóm xung đột, tiếng Việt: không nêu quốc gia đúng 2/20; kèm đoạn 13/20; so với nêu BYT: 9 sai thành đúng, 3 đúng thành sai (McNemar, khám phá: p = 0,15). Cùng nhóm, tiếng Anh, ba điều kiện, đúng: 3/20, 5/20, 13/20 (McNemar, khám phá: p = 0,02).</w:t>
       </w:r>
     </w:p>
     <w:p>
@@ -670,7 +670,7 @@
           <w:szCs w:val="24"/>
           <w14:ligatures w14:val="none"/>
         </w:rPr>
-        <w:t>Phần lớn câu sai không khớp nguồn đã ghi nhận; trùng chuẩn nước ngoài chưa rõ vượt mức ngẫu nhiên; kèm đoạn hướng dẫn vẫn còn sai. Kết quả sơ bộ, chưa có bác sĩ duyệt.</w:t>
+        <w:t>Phần lớn câu sai không khớp nguồn đã ghi nhận; chưa cho thấy trùng chuẩn nước ngoài vượt mức trùng mồi. Khi nêu BYT, nhóm đối chứng cũng đúng chưa đến một nửa. Kèm đoạn, đúng nhiều hơn nhưng vẫn còn sai; người học và thầy thuốc cần đối chiếu con số LLM đưa ra với hướng dẫn BYT hiện hành. Hạn chế: mẫu nhỏ chọn chủ đích, một mô hình, chỉ AI kiểm tra, chưa có bác sĩ duyệt, nhiều mồi kém hợp lý; câu đúng có thể trùng chuẩn nước ngoài khác. Tiếp theo: nghiên cứu chính (sẽ đăng ký trước) trên kho hướng dẫn BYT hiện hành, nhiều mô hình mở.</w:t>
       </w:r>
     </w:p>
     <w:p>

</xml_diff>